<commit_message>
Completa Guia 2.4 Desarrollo Proyecto APT Fase 2
</commit_message>
<xml_diff>
--- a/docs/Fase2/Evidencias_Grupales/2.4_GuiaEstudiante_Fase 2_DesarrolloProyecto APT.docx
+++ b/docs/Fase2/Evidencias_Grupales/2.4_GuiaEstudiante_Fase 2_DesarrolloProyecto APT.docx
@@ -4275,6 +4275,26 @@
           <w:lang w:val="es-ES"/>
         </w:rPr>
       </w:pPr>
+      <w:r>
+        <w:rPr>
+          <w:rFonts w:cs="Calibri Light"/>
+          <w:color w:val="595959" w:themeColor="text1" w:themeTint="A6"/>
+          <w:sz w:val="24"/>
+          <w:szCs w:val="24"/>
+          <w:lang w:val="es-ES"/>
+        </w:rPr>
+        <w:tab/>
+      </w:r>
+      <w:r>
+        <w:rPr>
+          <w:rFonts w:cs="Calibri Light"/>
+          <w:color w:val="595959" w:themeColor="text1" w:themeTint="A6"/>
+          <w:sz w:val="24"/>
+          <w:szCs w:val="24"/>
+          <w:lang w:val="es-ES"/>
+        </w:rPr>
+        <w:tab/>
+      </w:r>
     </w:p>
     <w:tbl>
       <w:tblPr>
@@ -4500,48 +4520,74 @@
           <w:p>
             <w:pPr>
               <w:spacing w:after="0" w:line="240" w:lineRule="auto"/>
-            </w:pPr>
-            <w:r>
-              <w:rPr>
-                <w:rFonts w:ascii="Calibri" w:hAnsi="Calibri"/>
-                <w:b/>
-                <w:sz w:val="17"/>
-              </w:rPr>
-              <w:t xml:space="preserve">Actividades que no has iniciado o están retrasadas: </w:t>
-            </w:r>
-            <w:r>
-              <w:rPr>
-                <w:rFonts w:ascii="Calibri" w:hAnsi="Calibri"/>
-                <w:sz w:val="17"/>
-              </w:rPr>
-              <w:t>Mapa interactivo: retrasado porque se priorizó autenticación, estabilidad y evidencia. Estrategia: implementar un mapa básico con lugares activos y acceso al detalle.</w:t>
-            </w:r>
-            <w:r>
-              <w:rPr>
-                <w:rFonts w:ascii="Calibri" w:hAnsi="Calibri"/>
-                <w:sz w:val="17"/>
+              <w:rPr>
+                <w:rFonts w:ascii="Calibri" w:hAnsi="Calibri" w:cs="Arial"/>
+                <w:i/>
+                <w:iCs/>
+                <w:color w:val="548DD4"/>
+                <w:sz w:val="20"/>
+                <w:szCs w:val="20"/>
+                <w:lang w:eastAsia="es-CL"/>
+              </w:rPr>
+            </w:pPr>
+            <w:r>
+              <w:rPr>
+                <w:rFonts w:ascii="Calibri" w:hAnsi="Calibri" w:cs="Arial"/>
+                <w:i/>
+                <w:iCs/>
+                <w:color w:val="548DD4"/>
+                <w:sz w:val="20"/>
+                <w:szCs w:val="20"/>
+                <w:lang w:eastAsia="es-CL"/>
+              </w:rPr>
+              <w:t>Actividades que no has iniciado o están retrasadas: Mapa interactivo: retrasado porque se priorizó autenticación, estabilidad y evidencia. Estrategia: implementar un mapa básico con lugares activos y acceso al detalle.</w:t>
+            </w:r>
+            <w:r>
+              <w:rPr>
+                <w:rFonts w:ascii="Calibri" w:hAnsi="Calibri" w:cs="Arial"/>
+                <w:i/>
+                <w:iCs/>
+                <w:color w:val="548DD4"/>
+                <w:sz w:val="20"/>
+                <w:szCs w:val="20"/>
+                <w:lang w:eastAsia="es-CL"/>
               </w:rPr>
               <w:br/>
             </w:r>
             <w:r>
               <w:rPr>
-                <w:rFonts w:ascii="Calibri" w:hAnsi="Calibri"/>
-                <w:sz w:val="17"/>
+                <w:rFonts w:ascii="Calibri" w:hAnsi="Calibri" w:cs="Arial"/>
+                <w:i/>
+                <w:iCs/>
+                <w:color w:val="548DD4"/>
+                <w:sz w:val="20"/>
+                <w:szCs w:val="20"/>
+                <w:lang w:eastAsia="es-CL"/>
               </w:rPr>
               <w:br/>
               <w:t>Búsqueda y filtros: la interfaz existe parcialmente, pero falta conectarla completamente a datos reales. Estrategia: comenzar con filtros por categoría/comuna.</w:t>
             </w:r>
             <w:r>
               <w:rPr>
-                <w:rFonts w:ascii="Calibri" w:hAnsi="Calibri"/>
-                <w:sz w:val="17"/>
+                <w:rFonts w:ascii="Calibri" w:hAnsi="Calibri" w:cs="Arial"/>
+                <w:i/>
+                <w:iCs/>
+                <w:color w:val="548DD4"/>
+                <w:sz w:val="20"/>
+                <w:szCs w:val="20"/>
+                <w:lang w:eastAsia="es-CL"/>
               </w:rPr>
               <w:br/>
             </w:r>
             <w:r>
               <w:rPr>
-                <w:rFonts w:ascii="Calibri" w:hAnsi="Calibri"/>
-                <w:sz w:val="17"/>
+                <w:rFonts w:ascii="Calibri" w:hAnsi="Calibri" w:cs="Arial"/>
+                <w:i/>
+                <w:iCs/>
+                <w:color w:val="548DD4"/>
+                <w:sz w:val="20"/>
+                <w:szCs w:val="20"/>
+                <w:lang w:eastAsia="es-CL"/>
               </w:rPr>
               <w:br/>
               <w:t xml:space="preserve">Flujo Usuario Negocio: iniciado, pero falta cerrar la verificación y reforzar permisos </w:t>
@@ -4549,49 +4595,100 @@
             <w:proofErr w:type="spellStart"/>
             <w:r>
               <w:rPr>
-                <w:rFonts w:ascii="Calibri" w:hAnsi="Calibri"/>
-                <w:sz w:val="17"/>
+                <w:rFonts w:ascii="Calibri" w:hAnsi="Calibri" w:cs="Arial"/>
+                <w:i/>
+                <w:iCs/>
+                <w:color w:val="548DD4"/>
+                <w:sz w:val="20"/>
+                <w:szCs w:val="20"/>
+                <w:lang w:eastAsia="es-CL"/>
               </w:rPr>
               <w:t>backend</w:t>
             </w:r>
             <w:proofErr w:type="spellEnd"/>
             <w:r>
               <w:rPr>
-                <w:rFonts w:ascii="Calibri" w:hAnsi="Calibri"/>
-                <w:sz w:val="17"/>
+                <w:rFonts w:ascii="Calibri" w:hAnsi="Calibri" w:cs="Arial"/>
+                <w:i/>
+                <w:iCs/>
+                <w:color w:val="548DD4"/>
+                <w:sz w:val="20"/>
+                <w:szCs w:val="20"/>
+                <w:lang w:eastAsia="es-CL"/>
               </w:rPr>
               <w:t xml:space="preserve"> para que cada negocio gestione solo sus recursos. Estrategia: completarlo antes de nuevas funciones.</w:t>
             </w:r>
             <w:r>
               <w:rPr>
-                <w:rFonts w:ascii="Calibri" w:hAnsi="Calibri"/>
-                <w:sz w:val="17"/>
+                <w:rFonts w:ascii="Calibri" w:hAnsi="Calibri" w:cs="Arial"/>
+                <w:i/>
+                <w:iCs/>
+                <w:color w:val="548DD4"/>
+                <w:sz w:val="20"/>
+                <w:szCs w:val="20"/>
+                <w:lang w:eastAsia="es-CL"/>
               </w:rPr>
               <w:br/>
             </w:r>
             <w:r>
               <w:rPr>
-                <w:rFonts w:ascii="Calibri" w:hAnsi="Calibri"/>
-                <w:sz w:val="17"/>
+                <w:rFonts w:ascii="Calibri" w:hAnsi="Calibri" w:cs="Arial"/>
+                <w:i/>
+                <w:iCs/>
+                <w:color w:val="548DD4"/>
+                <w:sz w:val="20"/>
+                <w:szCs w:val="20"/>
+                <w:lang w:eastAsia="es-CL"/>
               </w:rPr>
               <w:br/>
               <w:t>Favoritos, reseñas y rutas personalizadas: definidos en casos de uso, aún fuera del núcleo estable. Estrategia: incorporarlos después de completar flujos críticos.</w:t>
             </w:r>
             <w:r>
               <w:rPr>
-                <w:rFonts w:ascii="Calibri" w:hAnsi="Calibri"/>
-                <w:sz w:val="17"/>
+                <w:rFonts w:ascii="Calibri" w:hAnsi="Calibri" w:cs="Arial"/>
+                <w:i/>
+                <w:iCs/>
+                <w:color w:val="548DD4"/>
+                <w:sz w:val="20"/>
+                <w:szCs w:val="20"/>
+                <w:lang w:eastAsia="es-CL"/>
               </w:rPr>
               <w:br/>
             </w:r>
             <w:r>
               <w:rPr>
-                <w:rFonts w:ascii="Calibri" w:hAnsi="Calibri"/>
-                <w:sz w:val="17"/>
+                <w:rFonts w:ascii="Calibri" w:hAnsi="Calibri" w:cs="Arial"/>
+                <w:i/>
+                <w:iCs/>
+                <w:color w:val="548DD4"/>
+                <w:sz w:val="20"/>
+                <w:szCs w:val="20"/>
+                <w:lang w:eastAsia="es-CL"/>
               </w:rPr>
               <w:br/>
               <w:t>Documentación final y evidencias: en curso. Después de la evaluación 3,8 se priorizó completar la guía 2.4, ordenar las carpetas y asegurar que cada avance sea localizable y demostrable en GitHub.</w:t>
             </w:r>
+          </w:p>
+        </w:tc>
+      </w:tr>
+      <w:tr>
+        <w:tc>
+          <w:tcPr>
+            <w:tcW w:w="5000" w:type="pct"/>
+          </w:tcPr>
+          <w:p>
+            <w:pPr>
+              <w:spacing w:after="0" w:line="240" w:lineRule="auto"/>
+              <w:rPr>
+                <w:rFonts w:ascii="Calibri" w:hAnsi="Calibri" w:cs="Arial"/>
+                <w:i/>
+                <w:iCs/>
+                <w:color w:val="548DD4"/>
+                <w:sz w:val="20"/>
+                <w:szCs w:val="20"/>
+                <w:lang w:eastAsia="es-CL"/>
+              </w:rPr>
+            </w:pPr>
           </w:p>
         </w:tc>
       </w:tr>

</xml_diff>